<commit_message>
SC2 Responsive Elected Leaders: state-vs-local venue clarifications (approved) — scoped 'who draws the maps' to the State House/Senate/congressional maps all 21 bills address; added plain-language local-venue notes (county councils redraw their own lines under S.C. Code 4-9-90, verified on the official code site; roughly a dozen school-board reapportionment acts passed after the 2020 census, from the certified universe; districts control civics offerings beyond the state minimum); tightened the voter-information never-filed claim around existing 7-13-35 notice duties; lege brief kept at 7pp with spotlights ending flush before the glossary (no stranded page); citizen front brief re-verified 2pp both renders; record unchanged
Co-authored-by: CaptainWrechols <CaptainWrechols@users.noreply.github.com>
</commit_message>
<xml_diff>
--- a/briefs/south-carolina/responsive-elected-leaders/citizen-v2/SC1-Responsive-Elected-Leaders-Lege-Brief.docx
+++ b/briefs/south-carolina/responsive-elected-leaders/citizen-v2/SC1-Responsive-Elected-Leaders-Lege-Brief.docx
@@ -1125,7 +1125,7 @@
           <w:szCs w:val="20"/>
           <w:rtl w:val="0"/>
         </w:rPr>
-        <w:t xml:space="preserve">The federal decennial census sets the redistricting clock, and congressional maps must satisfy federal law — but who draws South Carolina's maps is state ground alone: the state constitution assigns reapportionment to the General Assembly, which is why the full commission design requires a state constitutional amendment (a two-thirds vote of each chamber plus a statewide referendum) and why the statutory designs route their plans back through the legislature. The Article V applications in this record run the other direction — the state asking Washington to act: the adopted congressional term-limits application (H3008) joins other states' applications toward the two-thirds needed for a convention, and it changes nothing in South Carolina law by itself. Civics curriculum is state ground entirely: the REACH Act and the middle-school proposal are state statutes, with the State Board of Education as the named curator. Voter information likewise — the State Election Commission (scvotes.gov) is the voter-facing agency, and nothing in federal or state law in this record directs anyone to build the neutral information tool participants described.</w:t>
+        <w:t xml:space="preserve">The federal ten-year census sets the redistricting clock, and congressional maps must satisfy federal law — but who draws each map is decided here, and the answer depends on which map. The State House, State Senate, and congressional maps — the maps all twenty-one filed bills address — belong to the General Assembly under the state constitution, which is why the full commission design requires a state constitutional amendment (a two-thirds vote of each chamber plus a statewide referendum) and why the statutory designs route their plans back through the legislature. Local lines are different ground: county councils redraw their own district lines after each census (Section 4-9-90), cities redraw their own wards, and school-board lines usually move through separate local acts — roughly a dozen passed after the 2020 census. So a concern about a county or school-board map runs through those local processes, not through the commission bills in this brief. The Article V applications in this record run the other direction — the state asking Washington to act: the adopted congressional term-limits application (H3008) joins other states' applications toward the two-thirds needed for a convention, and it changes nothing in South Carolina law by itself. Civics requirements are set in state law and State Board of Education standards — but local school districts control what they teach beyond the required minimum, so a district can add civics programs on its own, without a new state law; the bills in this record are about statewide requirements. On voter information, election offices already publish the official basics under current law — election dates, registration deadlines, precincts, and polling places. What no bill creates is the next step participants described: a neutral guide to the candidates and issues themselves. No bill assigns that job to anyone.</w:t>
       </w:r>
     </w:p>
     <w:p>
@@ -1236,7 +1236,7 @@
           <w:szCs w:val="20"/>
           <w:rtl w:val="0"/>
         </w:rPr>
-        <w:t xml:space="preserve">Raised in three of four in-person events, with very strong support where discussed. The concerns raised: how independent the commission would really be, and that keeping redistricting on the ten-year cycle would help. The record: twenty-one bills in three designs, none ever heard; the legislature drew the maps itself, and its one attempt to leave the ten-year cycle was shelved on the Senate floor.</w:t>
+        <w:t xml:space="preserve">Raised in three of four in-person events, with very strong support where discussed. The concerns raised: how independent the commission would really be, and that keeping redistricting on the ten-year cycle would help. The record: twenty-one bills in three designs, none ever heard; the legislature drew the maps itself.</w:t>
       </w:r>
     </w:p>
     <w:p>
@@ -1394,7 +1394,7 @@
           <w:szCs w:val="20"/>
           <w:rtl w:val="0"/>
         </w:rPr>
-        <w:t xml:space="preserve">the mid-decade congressional redraw — the record's only departure from the census cycle. Passed the House 74–37 near midnight after dozens of amendments were tabled (28 on roll-call votes, 55 tabling votes in all); the Senate then voted 26–18 to continue (set aside) the bill, ending it for the session. A companion, H4717 (2026), died in House Judiciary.</w:t>
+        <w:t xml:space="preserve">the mid-decade congressional redraw — the record's only departure from the census cycle. Passed the House 74–37 near midnight after dozens of amendments were tabled (28 on roll-call votes); the Senate then voted 26–18 to continue (set aside) the bill, ending it for the session. A companion, H4717 (2026), died in House Judiciary.</w:t>
       </w:r>
     </w:p>
     <w:p>
@@ -1453,7 +1453,7 @@
           <w:szCs w:val="20"/>
           <w:rtl w:val="0"/>
         </w:rPr>
-        <w:t xml:space="preserve">H3044 and S6 (2019), H3279 and S561 (2021), H3173 (2023) — nine members chosen by a three-member Applicant Review Panel appointed by the State Inspector General, with public deliberations; S135 (2019) kept the nine-member referendum design with a different selection route. Needs two-thirds of each chamber plus a statewide referendum.</w:t>
+        <w:t xml:space="preserve">H3044 and S6 (2019), H3279 and S561 (2021), H3173 (2023) — nine members chosen by a three-member Applicant Review Panel appointed by the State Inspector General; S135 (2019) kept the nine-member referendum design with a different selection route.</w:t>
       </w:r>
     </w:p>
     <w:p>
@@ -1493,7 +1493,7 @@
           <w:szCs w:val="20"/>
           <w:rtl w:val="0"/>
         </w:rPr>
-        <w:t xml:space="preserve">H3432 and S254 (2019), H4201 and H4202 (2021), H3243 and H3245 (2023) — members appointed under State Ethics Commission oversight on the census cycle; the 2021 and 2023 versions bar legislative or executive alteration of or veto over the final plan and forbid adjourning for the year until it is adopted.</w:t>
+        <w:t xml:space="preserve">H3432 and S254 (2019), H4201 and H4202 (2021), H3243 and H3245 (2023) — members appointed under State Ethics Commission oversight; the 2021 and 2023 versions bar any alteration or veto of the final plan and forbid adjourning for the year until it is adopted.</w:t>
       </w:r>
     </w:p>
     <w:p>
@@ -1632,7 +1632,7 @@
           <w:szCs w:val="20"/>
           <w:rtl w:val="0"/>
         </w:rPr>
-        <w:t xml:space="preserve">the filed designs answer it three different ways — who appoints (an Inspector General panel versus the State Ethics Commission), party balance (five/five/two in H4222), whether the plan can be altered or vetoed (barred in the 2021–2023 citizens-commission bills), and whether voters approve the maps (the referendum designs). None was ever tested in a hearing, so the record contains no legislative verdict on any of them.</w:t>
+        <w:t xml:space="preserve">the filed designs answer it different ways — who appoints (an Inspector General panel versus the State Ethics Commission), party balance (five/five/two in H4222), whether the plan can be altered or vetoed (barred in the 2021–2023 bills), and whether voters approve the maps by referendum. None was ever tested in a hearing, so the record holds no legislative verdict on any of them.</w:t>
       </w:r>
     </w:p>
     <w:p>
@@ -1677,6 +1677,46 @@
     </w:p>
     <w:p>
       <w:pPr>
+        <w:widowControl/>
+        <w:spacing w:after="80"/>
+        <w:ind w:left="200" w:firstLine="0"/>
+        <w:rPr/>
+      </w:pPr>
+      <w:r>
+        <w:rPr>
+          <w:rFonts w:ascii="Arial" w:cs="Arial" w:eastAsia="Arial" w:hAnsi="Arial"/>
+          <w:color w:val="c0392b"/>
+          <w:sz w:val="20"/>
+          <w:szCs w:val="20"/>
+          <w:rtl w:val="0"/>
+        </w:rPr>
+        <w:t xml:space="preserve">▪  </w:t>
+      </w:r>
+      <w:r>
+        <w:rPr>
+          <w:rFonts w:ascii="Arial" w:cs="Arial" w:eastAsia="Arial" w:hAnsi="Arial"/>
+          <w:b w:val="1"/>
+          <w:bCs w:val="1"/>
+          <w:color w:val="1a2d4f"/>
+          <w:sz w:val="20"/>
+          <w:szCs w:val="20"/>
+          <w:rtl w:val="0"/>
+        </w:rPr>
+        <w:t xml:space="preserve">Which maps these bills cover: </w:t>
+      </w:r>
+      <w:r>
+        <w:rPr>
+          <w:rFonts w:ascii="Arial" w:cs="Arial" w:eastAsia="Arial" w:hAnsi="Arial"/>
+          <w:color w:val="444444"/>
+          <w:sz w:val="20"/>
+          <w:szCs w:val="20"/>
+          <w:rtl w:val="0"/>
+        </w:rPr>
+        <w:t xml:space="preserve">all twenty-one address the State House, State Senate, and congressional maps — none touches county council or school-board lines. Those maps have their own routes: county councils redraw their own districts after each census under existing law (Section 4-9-90), and school-board lines usually move through separate local acts (roughly a dozen passed after the 2020 census, not counted here). A local-map concern needs no new state law.</w:t>
+      </w:r>
+    </w:p>
+    <w:p>
+      <w:pPr>
         <w:keepNext/>
         <w:spacing w:before="70" w:after="30" w:line="250" w:lineRule="auto"/>
         <w:rPr/>
@@ -1946,7 +1986,7 @@
           <w:szCs w:val="20"/>
           <w:rtl w:val="0"/>
         </w:rPr>
-        <w:t xml:space="preserve">the design closest to the proposal — every middle schooler completes a civics unit with instructional and hands-on components, plus the statewide Palmetto Middle School Civics Challenge for student-led projects; the State Board of Education would adopt the curriculum before the 2027-28 school year. Sits in House Education and Public Works.</w:t>
+        <w:t xml:space="preserve">the design closest to the proposal — a required civics unit for every middle schooler, plus the statewide Palmetto Middle School Civics Challenge for student-led projects; the State Board of Education would adopt the curriculum before the 2027-28 school year. Sits in House Education and Public Works.</w:t>
       </w:r>
     </w:p>
     <w:p>
@@ -1986,7 +2026,7 @@
           <w:szCs w:val="20"/>
           <w:rtl w:val="0"/>
         </w:rPr>
-        <w:t xml:space="preserve">the neutrality worry approached from the other direction — limits on what civics teachers can be compelled to discuss, no credit for student lobbying, no private funding for civics curriculum or teacher training. Died in the same committee.</w:t>
+        <w:t xml:space="preserve">the neutrality worry approached from the other direction — limits on what civics teachers can be compelled to discuss and no private funding for civics curriculum or teacher training. Died in the same committee.</w:t>
       </w:r>
     </w:p>
     <w:p>
@@ -2045,7 +2085,47 @@
           <w:szCs w:val="20"/>
           <w:rtl w:val="0"/>
         </w:rPr>
-        <w:t xml:space="preserve">The curator question exists in the record from both directions: H3547 names the State Board of Education as curriculum curator, while H4392 would have restricted content and funding sources — and the legislature has voted on neither. No bill defines "neutral" civic information or assigns anyone to curate it.</w:t>
+        <w:t xml:space="preserve">The curator question exists in the record from both directions: H3547 names the State Board of Education as curriculum curator, while H4392 would have restricted content and funding sources — and the legislature has voted on neither.</w:t>
+      </w:r>
+    </w:p>
+    <w:p>
+      <w:pPr>
+        <w:widowControl/>
+        <w:spacing w:after="80"/>
+        <w:ind w:left="200" w:firstLine="0"/>
+        <w:rPr/>
+      </w:pPr>
+      <w:r>
+        <w:rPr>
+          <w:rFonts w:ascii="Arial" w:cs="Arial" w:eastAsia="Arial" w:hAnsi="Arial"/>
+          <w:color w:val="c0392b"/>
+          <w:sz w:val="20"/>
+          <w:szCs w:val="20"/>
+          <w:rtl w:val="0"/>
+        </w:rPr>
+        <w:t xml:space="preserve">▪  </w:t>
+      </w:r>
+      <w:r>
+        <w:rPr>
+          <w:rFonts w:ascii="Arial" w:cs="Arial" w:eastAsia="Arial" w:hAnsi="Arial"/>
+          <w:b w:val="1"/>
+          <w:bCs w:val="1"/>
+          <w:color w:val="1a2d4f"/>
+          <w:sz w:val="20"/>
+          <w:szCs w:val="20"/>
+          <w:rtl w:val="0"/>
+        </w:rPr>
+        <w:t xml:space="preserve">The district lever: </w:t>
+      </w:r>
+      <w:r>
+        <w:rPr>
+          <w:rFonts w:ascii="Arial" w:cs="Arial" w:eastAsia="Arial" w:hAnsi="Arial"/>
+          <w:color w:val="444444"/>
+          <w:sz w:val="20"/>
+          <w:szCs w:val="20"/>
+          <w:rtl w:val="0"/>
+        </w:rPr>
+        <w:t xml:space="preserve">state law sets the required minimum, but local school boards decide what their schools teach beyond it — a district can add civics coursework on its own, without a new state law. The bills in this record are statewide requirements that would cover every district.</w:t>
       </w:r>
     </w:p>
     <w:p>
@@ -2094,17 +2174,36 @@
           <w:szCs w:val="20"/>
           <w:rtl w:val="0"/>
         </w:rPr>
-        <w:t xml:space="preserve">FY 2024-25 proviso 45.11: </w:t>
-      </w:r>
-      <w:r>
-        <w:rPr>
-          <w:rFonts w:ascii="Arial" w:cs="Arial" w:eastAsia="Arial" w:hAnsi="Arial"/>
-          <w:color w:val="444444"/>
-          <w:sz w:val="20"/>
-          <w:szCs w:val="20"/>
-          <w:rtl w:val="0"/>
-        </w:rPr>
-        <w:t xml:space="preserve">a Clemson feasibility study for a Center for Civic Engagement.</w:t>
+        <w:t xml:space="preserve">FY 2024-25 proviso 45.11 </w:t>
+      </w:r>
+      <w:r>
+        <w:rPr>
+          <w:rFonts w:ascii="Arial" w:cs="Arial" w:eastAsia="Arial" w:hAnsi="Arial"/>
+          <w:color w:val="444444"/>
+          <w:sz w:val="20"/>
+          <w:szCs w:val="20"/>
+          <w:rtl w:val="0"/>
+        </w:rPr>
+        <w:t xml:space="preserve">funded a Clemson feasibility study for a Center for Civic Engagement, and FY 2026-27 (inside proviso 118.21) put $2.5 million toward USC's Center for American Civic Leadership and Public Discourse — one-year funding decisions, each naming a university as the home.</w:t>
+      </w:r>
+    </w:p>
+    <w:p>
+      <w:pPr>
+        <w:keepNext/>
+        <w:spacing w:before="70" w:after="30" w:line="250" w:lineRule="auto"/>
+        <w:rPr/>
+      </w:pPr>
+      <w:r>
+        <w:rPr>
+          <w:rFonts w:ascii="Arial" w:cs="Arial" w:eastAsia="Arial" w:hAnsi="Arial"/>
+          <w:b w:val="1"/>
+          <w:bCs w:val="1"/>
+          <w:color w:val="2e4a78"/>
+          <w:sz w:val="24"/>
+          <w:szCs w:val="24"/>
+          <w:rtl w:val="0"/>
+        </w:rPr>
+        <w:t xml:space="preserve">Never filed</w:t>
       </w:r>
     </w:p>
     <w:p>
@@ -2134,65 +2233,6 @@
           <w:szCs w:val="20"/>
           <w:rtl w:val="0"/>
         </w:rPr>
-        <w:t xml:space="preserve">FY 2026-27 (inside proviso 118.21): </w:t>
-      </w:r>
-      <w:r>
-        <w:rPr>
-          <w:rFonts w:ascii="Arial" w:cs="Arial" w:eastAsia="Arial" w:hAnsi="Arial"/>
-          <w:color w:val="444444"/>
-          <w:sz w:val="20"/>
-          <w:szCs w:val="20"/>
-          <w:rtl w:val="0"/>
-        </w:rPr>
-        <w:t xml:space="preserve">$2.5 million for USC's Center for American Civic Leadership and Public Discourse. Both are one-year funding decisions naming a university as the home.</w:t>
-      </w:r>
-    </w:p>
-    <w:p>
-      <w:pPr>
-        <w:keepNext/>
-        <w:spacing w:before="70" w:after="30" w:line="250" w:lineRule="auto"/>
-        <w:rPr/>
-      </w:pPr>
-      <w:r>
-        <w:rPr>
-          <w:rFonts w:ascii="Arial" w:cs="Arial" w:eastAsia="Arial" w:hAnsi="Arial"/>
-          <w:b w:val="1"/>
-          <w:bCs w:val="1"/>
-          <w:color w:val="2e4a78"/>
-          <w:sz w:val="24"/>
-          <w:szCs w:val="24"/>
-          <w:rtl w:val="0"/>
-        </w:rPr>
-        <w:t xml:space="preserve">Never filed</w:t>
-      </w:r>
-    </w:p>
-    <w:p>
-      <w:pPr>
-        <w:widowControl/>
-        <w:spacing w:after="80"/>
-        <w:ind w:left="200" w:firstLine="0"/>
-        <w:rPr/>
-      </w:pPr>
-      <w:r>
-        <w:rPr>
-          <w:rFonts w:ascii="Arial" w:cs="Arial" w:eastAsia="Arial" w:hAnsi="Arial"/>
-          <w:color w:val="c0392b"/>
-          <w:sz w:val="20"/>
-          <w:szCs w:val="20"/>
-          <w:rtl w:val="0"/>
-        </w:rPr>
-        <w:t xml:space="preserve">▪  </w:t>
-      </w:r>
-      <w:r>
-        <w:rPr>
-          <w:rFonts w:ascii="Arial" w:cs="Arial" w:eastAsia="Arial" w:hAnsi="Arial"/>
-          <w:b w:val="1"/>
-          <w:bCs w:val="1"/>
-          <w:color w:val="1a2d4f"/>
-          <w:sz w:val="20"/>
-          <w:szCs w:val="20"/>
-          <w:rtl w:val="0"/>
-        </w:rPr>
         <w:t xml:space="preserve"> </w:t>
       </w:r>
       <w:r>
@@ -2203,7 +2243,7 @@
           <w:szCs w:val="20"/>
           <w:rtl w:val="0"/>
         </w:rPr>
-        <w:t xml:space="preserve">No bill from 2019–2026 proposes a neutral voter-information tool for voters or assigns any agency — including the State Election Commission, the state's voter-facing agency — to build or curate one.</w:t>
+        <w:t xml:space="preserve">Election offices already publish the official basics — election dates, deadlines, precincts, and polling places. No bill from 2019–2026 proposes the next step participants described — a neutral guide to the candidates and issues — or assigns that job to any agency, state or county.</w:t>
       </w:r>
     </w:p>
     <w:p>

</xml_diff>